<commit_message>
Fix Strategy Type values to match the Excel dropdown
Retype all 20 recovery strategies using only the eight dropdown options. Combinations such as Technology + People are replaced with valid list values based on each function, its impact, and the BIA recovery summary.

Co-authored-by: eyushans <eyushans@gmail.com>
</commit_message>
<xml_diff>
--- a/Technical_Department_Recovery_Strategy_Register.docx
+++ b/Technical_Department_Recovery_Strategy_Register.docx
@@ -1675,7 +1675,7 @@
                 <w:color w:val="1A1A1A"/>
                 <w:sz w:val="14"/>
               </w:rPr>
-              <w:t>Technology</w:t>
+              <w:t>People + Process + Technology</w:t>
             </w:r>
           </w:p>
         </w:tc>
@@ -2141,7 +2141,7 @@
                 <w:color w:val="1A1A1A"/>
                 <w:sz w:val="14"/>
               </w:rPr>
-              <w:t>People</w:t>
+              <w:t>People + Process</w:t>
             </w:r>
           </w:p>
         </w:tc>
@@ -3073,7 +3073,7 @@
                 <w:color w:val="1A1A1A"/>
                 <w:sz w:val="14"/>
               </w:rPr>
-              <w:t>Technology</w:t>
+              <w:t>People + Technology</w:t>
             </w:r>
           </w:p>
         </w:tc>
@@ -3539,7 +3539,7 @@
                 <w:color w:val="1A1A1A"/>
                 <w:sz w:val="14"/>
               </w:rPr>
-              <w:t>Technology + People</w:t>
+              <w:t>People + Process + Technology</w:t>
             </w:r>
           </w:p>
         </w:tc>
@@ -4005,7 +4005,7 @@
                 <w:color w:val="1A1A1A"/>
                 <w:sz w:val="14"/>
               </w:rPr>
-              <w:t>Technology + People</w:t>
+              <w:t>People + Process + Technology</w:t>
             </w:r>
           </w:p>
         </w:tc>
@@ -4471,7 +4471,7 @@
                 <w:color w:val="1A1A1A"/>
                 <w:sz w:val="14"/>
               </w:rPr>
-              <w:t>Technology</w:t>
+              <w:t>People + Process + Technology</w:t>
             </w:r>
           </w:p>
         </w:tc>
@@ -5403,7 +5403,7 @@
                 <w:color w:val="1A1A1A"/>
                 <w:sz w:val="14"/>
               </w:rPr>
-              <w:t>Technology + People</w:t>
+              <w:t>People + Process + Technology</w:t>
             </w:r>
           </w:p>
         </w:tc>
@@ -5869,7 +5869,7 @@
                 <w:color w:val="1A1A1A"/>
                 <w:sz w:val="14"/>
               </w:rPr>
-              <w:t>Technology</w:t>
+              <w:t>People + Technology</w:t>
             </w:r>
           </w:p>
         </w:tc>
@@ -6335,7 +6335,7 @@
                 <w:color w:val="1A1A1A"/>
                 <w:sz w:val="14"/>
               </w:rPr>
-              <w:t>Technology + People</w:t>
+              <w:t>People + Process + Technology</w:t>
             </w:r>
           </w:p>
         </w:tc>
@@ -6801,7 +6801,7 @@
                 <w:color w:val="1A1A1A"/>
                 <w:sz w:val="14"/>
               </w:rPr>
-              <w:t>People + Technology</w:t>
+              <w:t>People + Process + Technology</w:t>
             </w:r>
           </w:p>
         </w:tc>
@@ -7267,7 +7267,7 @@
                 <w:color w:val="1A1A1A"/>
                 <w:sz w:val="14"/>
               </w:rPr>
-              <w:t>People + Technology</w:t>
+              <w:t>People + Process + Technology</w:t>
             </w:r>
           </w:p>
         </w:tc>
@@ -7733,7 +7733,7 @@
                 <w:color w:val="1A1A1A"/>
                 <w:sz w:val="14"/>
               </w:rPr>
-              <w:t>People</w:t>
+              <w:t>People + Process</w:t>
             </w:r>
           </w:p>
         </w:tc>
@@ -8199,7 +8199,7 @@
                 <w:color w:val="1A1A1A"/>
                 <w:sz w:val="14"/>
               </w:rPr>
-              <w:t>Technology</w:t>
+              <w:t>People + Technology</w:t>
             </w:r>
           </w:p>
         </w:tc>
@@ -8665,7 +8665,7 @@
                 <w:color w:val="1A1A1A"/>
                 <w:sz w:val="14"/>
               </w:rPr>
-              <w:t>Technology</w:t>
+              <w:t>People + Technology</w:t>
             </w:r>
           </w:p>
         </w:tc>
@@ -9131,7 +9131,7 @@
                 <w:color w:val="1A1A1A"/>
                 <w:sz w:val="14"/>
               </w:rPr>
-              <w:t>People + Technology</w:t>
+              <w:t>People + Process + Technology</w:t>
             </w:r>
           </w:p>
         </w:tc>
@@ -9597,7 +9597,7 @@
                 <w:color w:val="1A1A1A"/>
                 <w:sz w:val="14"/>
               </w:rPr>
-              <w:t>People</w:t>
+              <w:t>People + Process</w:t>
             </w:r>
           </w:p>
         </w:tc>

</xml_diff>